<commit_message>
Ajustes no relatorio e limpeza do repositorio
- Corrige inconsistencia: modelo usado e YOLOv8n (nao YOLOv8m)
  Atualiza secao 2 com justificativa correta da escolha da variante nano
- Adiciona exemplos visuais de predicoes corretas e incorretas em
  exemplos_inferencia/ (2 fuzis, mista pistola+fuzil, falso negativo)
- Inclui curvas F1-Confidence e Precision-Recall no relatorio
- Adiciona discussao sobre early stopping (best.pt = epoca 28)
- Remove pastas de validacao intermediarias (val, val2...val13)
  geradas pelo Ultralytics durante execucoes

Co-Authored-By: Claude Opus 4.7 <noreply@anthropic.com>
</commit_message>
<xml_diff>
--- a/relatorio_trabalho_pratico.docx
+++ b/relatorio_trabalho_pratico.docx
@@ -73,7 +73,7 @@
           <w:i w:val="0"/>
           <w:sz w:val="22"/>
         </w:rPr>
-        <w:t>Foi utilizada Detecção de Objetos com o modelo YOLOv8m (You Only Look Once — versão 8, variante medium), aplicando Transfer Learning a partir de pesos pré-treinados no dataset COCO (80 classes gerais).</w:t>
+        <w:t>Foi utilizada Detecção de Objetos com o modelo YOLOv8n (You Only Look Once — versão 8, variante nano), aplicando Transfer Learning a partir de pesos pré-treinados no dataset COCO (80 classes gerais), com estratégia de backbone congelado (freeze=10).</w:t>
       </w:r>
     </w:p>
     <w:p>
@@ -116,7 +116,18 @@
         <w:rPr>
           <w:sz w:val="22"/>
         </w:rPr>
-        <w:t>A variante medium (yolov8m) oferece equilíbrio entre capacidade de aprendizado e custo computacional, sendo mais adequada que o nano (yolov8n) para um dataset com variações de fundo e ângulo.</w:t>
+        <w:t>A variante nano (yolov8n) foi escolhida por ter menos parâmetros (~3M), reduzindo o risco de overfitting em um dataset pequeno (~100 imagens anotadas). Testes com a variante medium (yolov8m, ~25M parâmetros) apresentaram resultados piores no conjunto de teste, justamente por excesso de capacidade em relação ao volume de dados;</w:t>
+      </w:r>
+    </w:p>
+    <w:p>
+      <w:pPr>
+        <w:pStyle w:val="ListBullet"/>
+      </w:pPr>
+      <w:r>
+        <w:rPr>
+          <w:sz w:val="22"/>
+        </w:rPr>
+        <w:t>Com backbone congelado (freeze=10), apenas a cabeça de detecção é ajustada, preservando as features genéricas do COCO — estratégia clássica para cenários com poucos dados.</w:t>
       </w:r>
     </w:p>
     <w:p>
@@ -1579,6 +1590,16 @@
     <w:p>
       <w:r>
         <w:rPr>
+          <w:b w:val="0"/>
+          <w:i w:val="0"/>
+          <w:sz w:val="22"/>
+        </w:rPr>
+        <w:t>Sobre o early stopping: o treino foi configurado para 100 épocas com patience=40, mas foi interrompido na época 68 porque o melhor mAP (0.833) foi atingido na época 28 e não houve melhora nas 40 épocas seguintes. O arquivo best.pt salvo corresponde à época 28, época com o melhor desempenho na validação — estratégia padrão do Ultralytics para evitar overfitting de épocas finais.</w:t>
+      </w:r>
+    </w:p>
+    <w:p>
+      <w:r>
+        <w:rPr>
           <w:b/>
           <w:i w:val="0"/>
           <w:sz w:val="22"/>
@@ -1726,6 +1747,322 @@
           <w:sz w:val="18"/>
         </w:rPr>
         <w:t>Figura 2 — Matriz de confusão normalizada (validação)</w:t>
+      </w:r>
+    </w:p>
+    <w:p/>
+    <w:p>
+      <w:r>
+        <w:drawing>
+          <wp:inline xmlns:a="http://schemas.openxmlformats.org/drawingml/2006/main" xmlns:pic="http://schemas.openxmlformats.org/drawingml/2006/picture">
+            <wp:extent cx="4572000" cy="3048000"/>
+            <wp:docPr id="3" name="Picture 3"/>
+            <wp:cNvGraphicFramePr>
+              <a:graphicFrameLocks noChangeAspect="1"/>
+            </wp:cNvGraphicFramePr>
+            <a:graphic>
+              <a:graphicData uri="http://schemas.openxmlformats.org/drawingml/2006/picture">
+                <pic:pic>
+                  <pic:nvPicPr>
+                    <pic:cNvPr id="0" name="BoxF1_curve.png"/>
+                    <pic:cNvPicPr/>
+                  </pic:nvPicPr>
+                  <pic:blipFill>
+                    <a:blip r:embed="rId11"/>
+                    <a:stretch>
+                      <a:fillRect/>
+                    </a:stretch>
+                  </pic:blipFill>
+                  <pic:spPr>
+                    <a:xfrm>
+                      <a:off x="0" y="0"/>
+                      <a:ext cx="4572000" cy="3048000"/>
+                    </a:xfrm>
+                    <a:prstGeom prst="rect"/>
+                  </pic:spPr>
+                </pic:pic>
+              </a:graphicData>
+            </a:graphic>
+          </wp:inline>
+        </w:drawing>
+      </w:r>
+    </w:p>
+    <w:p>
+      <w:pPr>
+        <w:jc w:val="center"/>
+      </w:pPr>
+      <w:r>
+        <w:rPr>
+          <w:i/>
+          <w:sz w:val="18"/>
+        </w:rPr>
+        <w:t>Figura 3 — Curva F1 × Confiança por classe</w:t>
+      </w:r>
+    </w:p>
+    <w:p/>
+    <w:p>
+      <w:r>
+        <w:drawing>
+          <wp:inline xmlns:a="http://schemas.openxmlformats.org/drawingml/2006/main" xmlns:pic="http://schemas.openxmlformats.org/drawingml/2006/picture">
+            <wp:extent cx="4572000" cy="3048000"/>
+            <wp:docPr id="4" name="Picture 4"/>
+            <wp:cNvGraphicFramePr>
+              <a:graphicFrameLocks noChangeAspect="1"/>
+            </wp:cNvGraphicFramePr>
+            <a:graphic>
+              <a:graphicData uri="http://schemas.openxmlformats.org/drawingml/2006/picture">
+                <pic:pic>
+                  <pic:nvPicPr>
+                    <pic:cNvPr id="0" name="BoxPR_curve.png"/>
+                    <pic:cNvPicPr/>
+                  </pic:nvPicPr>
+                  <pic:blipFill>
+                    <a:blip r:embed="rId12"/>
+                    <a:stretch>
+                      <a:fillRect/>
+                    </a:stretch>
+                  </pic:blipFill>
+                  <pic:spPr>
+                    <a:xfrm>
+                      <a:off x="0" y="0"/>
+                      <a:ext cx="4572000" cy="3048000"/>
+                    </a:xfrm>
+                    <a:prstGeom prst="rect"/>
+                  </pic:spPr>
+                </pic:pic>
+              </a:graphicData>
+            </a:graphic>
+          </wp:inline>
+        </w:drawing>
+      </w:r>
+    </w:p>
+    <w:p>
+      <w:pPr>
+        <w:jc w:val="center"/>
+      </w:pPr>
+      <w:r>
+        <w:rPr>
+          <w:i/>
+          <w:sz w:val="18"/>
+        </w:rPr>
+        <w:t>Figura 4 — Curva Precision × Recall por classe</w:t>
+      </w:r>
+    </w:p>
+    <w:p/>
+    <w:p>
+      <w:r>
+        <w:rPr>
+          <w:b/>
+          <w:i w:val="0"/>
+          <w:sz w:val="22"/>
+        </w:rPr>
+        <w:t>Análise qualitativa: predições corretas e incorretas</w:t>
+      </w:r>
+    </w:p>
+    <w:p>
+      <w:r>
+        <w:rPr>
+          <w:b w:val="0"/>
+          <w:i w:val="0"/>
+          <w:sz w:val="22"/>
+        </w:rPr>
+        <w:t>Na execução de inferência sobre as 15 imagens do conjunto de teste, o modelo detectou armas em 13 imagens e falhou em 2 (falsos negativos). Abaixo são apresentados exemplos representativos de cada caso.</w:t>
+      </w:r>
+    </w:p>
+    <w:p/>
+    <w:p>
+      <w:r>
+        <w:rPr>
+          <w:b/>
+          <w:i w:val="0"/>
+          <w:sz w:val="22"/>
+        </w:rPr>
+        <w:t>(a) Predição correta — 2 fuzis:</w:t>
+      </w:r>
+    </w:p>
+    <w:p>
+      <w:r>
+        <w:drawing>
+          <wp:inline xmlns:a="http://schemas.openxmlformats.org/drawingml/2006/main" xmlns:pic="http://schemas.openxmlformats.org/drawingml/2006/picture">
+            <wp:extent cx="4114800" cy="2337435"/>
+            <wp:docPr id="5" name="Picture 5"/>
+            <wp:cNvGraphicFramePr>
+              <a:graphicFrameLocks noChangeAspect="1"/>
+            </wp:cNvGraphicFramePr>
+            <a:graphic>
+              <a:graphicData uri="http://schemas.openxmlformats.org/drawingml/2006/picture">
+                <pic:pic>
+                  <pic:nvPicPr>
+                    <pic:cNvPr id="0" name="predicao_correta_fuzis.jpg"/>
+                    <pic:cNvPicPr/>
+                  </pic:nvPicPr>
+                  <pic:blipFill>
+                    <a:blip r:embed="rId13"/>
+                    <a:stretch>
+                      <a:fillRect/>
+                    </a:stretch>
+                  </pic:blipFill>
+                  <pic:spPr>
+                    <a:xfrm>
+                      <a:off x="0" y="0"/>
+                      <a:ext cx="4114800" cy="2337435"/>
+                    </a:xfrm>
+                    <a:prstGeom prst="rect"/>
+                  </pic:spPr>
+                </pic:pic>
+              </a:graphicData>
+            </a:graphic>
+          </wp:inline>
+        </w:drawing>
+      </w:r>
+    </w:p>
+    <w:p>
+      <w:pPr>
+        <w:jc w:val="center"/>
+      </w:pPr>
+      <w:r>
+        <w:rPr>
+          <w:i/>
+          <w:sz w:val="18"/>
+        </w:rPr>
+        <w:t>Figura 5 — Detecção correta: 2 fuzis identificados com bounding boxes bem posicionados e alta confiança. O modelo separou corretamente os dois objetos sobrepostos.</w:t>
+      </w:r>
+    </w:p>
+    <w:p/>
+    <w:p>
+      <w:r>
+        <w:rPr>
+          <w:b/>
+          <w:i w:val="0"/>
+          <w:sz w:val="22"/>
+        </w:rPr>
+        <w:t>(b) Predição correta — detecção mista (Pistola + Fuzil):</w:t>
+      </w:r>
+    </w:p>
+    <w:p>
+      <w:r>
+        <w:drawing>
+          <wp:inline xmlns:a="http://schemas.openxmlformats.org/drawingml/2006/main" xmlns:pic="http://schemas.openxmlformats.org/drawingml/2006/picture">
+            <wp:extent cx="4114800" cy="2294142"/>
+            <wp:docPr id="6" name="Picture 6"/>
+            <wp:cNvGraphicFramePr>
+              <a:graphicFrameLocks noChangeAspect="1"/>
+            </wp:cNvGraphicFramePr>
+            <a:graphic>
+              <a:graphicData uri="http://schemas.openxmlformats.org/drawingml/2006/picture">
+                <pic:pic>
+                  <pic:nvPicPr>
+                    <pic:cNvPr id="0" name="predicao_correta_mista.jpg"/>
+                    <pic:cNvPicPr/>
+                  </pic:nvPicPr>
+                  <pic:blipFill>
+                    <a:blip r:embed="rId14"/>
+                    <a:stretch>
+                      <a:fillRect/>
+                    </a:stretch>
+                  </pic:blipFill>
+                  <pic:spPr>
+                    <a:xfrm>
+                      <a:off x="0" y="0"/>
+                      <a:ext cx="4114800" cy="2294142"/>
+                    </a:xfrm>
+                    <a:prstGeom prst="rect"/>
+                  </pic:spPr>
+                </pic:pic>
+              </a:graphicData>
+            </a:graphic>
+          </wp:inline>
+        </w:drawing>
+      </w:r>
+    </w:p>
+    <w:p>
+      <w:pPr>
+        <w:jc w:val="center"/>
+      </w:pPr>
+      <w:r>
+        <w:rPr>
+          <w:i/>
+          <w:sz w:val="18"/>
+        </w:rPr>
+        <w:t>Figura 6 — Detecção correta de classes diferentes na mesma imagem: o modelo distinguiu corretamente a pistola do fuzil, mostrando que aprendeu as características discriminantes entre as duas classes.</w:t>
+      </w:r>
+    </w:p>
+    <w:p/>
+    <w:p>
+      <w:r>
+        <w:rPr>
+          <w:b/>
+          <w:i w:val="0"/>
+          <w:sz w:val="22"/>
+        </w:rPr>
+        <w:t>(c) Predição incorreta (falso negativo):</w:t>
+      </w:r>
+    </w:p>
+    <w:p>
+      <w:r>
+        <w:drawing>
+          <wp:inline xmlns:a="http://schemas.openxmlformats.org/drawingml/2006/main" xmlns:pic="http://schemas.openxmlformats.org/drawingml/2006/picture">
+            <wp:extent cx="4114800" cy="2744539"/>
+            <wp:docPr id="7" name="Picture 7"/>
+            <wp:cNvGraphicFramePr>
+              <a:graphicFrameLocks noChangeAspect="1"/>
+            </wp:cNvGraphicFramePr>
+            <a:graphic>
+              <a:graphicData uri="http://schemas.openxmlformats.org/drawingml/2006/picture">
+                <pic:pic>
+                  <pic:nvPicPr>
+                    <pic:cNvPr id="0" name="predicao_falso_negativo.jpg"/>
+                    <pic:cNvPicPr/>
+                  </pic:nvPicPr>
+                  <pic:blipFill>
+                    <a:blip r:embed="rId15"/>
+                    <a:stretch>
+                      <a:fillRect/>
+                    </a:stretch>
+                  </pic:blipFill>
+                  <pic:spPr>
+                    <a:xfrm>
+                      <a:off x="0" y="0"/>
+                      <a:ext cx="4114800" cy="2744539"/>
+                    </a:xfrm>
+                    <a:prstGeom prst="rect"/>
+                  </pic:spPr>
+                </pic:pic>
+              </a:graphicData>
+            </a:graphic>
+          </wp:inline>
+        </w:drawing>
+      </w:r>
+    </w:p>
+    <w:p>
+      <w:pPr>
+        <w:jc w:val="center"/>
+      </w:pPr>
+      <w:r>
+        <w:rPr>
+          <w:i/>
+          <w:sz w:val="18"/>
+        </w:rPr>
+        <w:t>Figura 7 — Falso negativo: arma presente na imagem mas não detectada pelo modelo. Provável causa: ângulo, iluminação ou fundo diferente dos exemplos vistos no treino. Este tipo de erro evidencia o limite de generalização de um modelo treinado com poucas amostras.</w:t>
+      </w:r>
+    </w:p>
+    <w:p>
+      <w:r>
+        <w:rPr>
+          <w:b/>
+          <w:i w:val="0"/>
+          <w:sz w:val="22"/>
+        </w:rPr>
+        <w:t>Discussão dos erros:</w:t>
+      </w:r>
+    </w:p>
+    <w:p>
+      <w:r>
+        <w:rPr>
+          <w:b w:val="0"/>
+          <w:i w:val="0"/>
+          <w:sz w:val="22"/>
+        </w:rPr>
+        <w:t>O recall de 0.583 no conjunto de teste indica que aproximadamente 42% dos objetos anotados não foram detectados. Análise visual sugere que os falsos negativos ocorrem principalmente em imagens com: (1) ângulos atípicos não representados no treino; (2) oclusão parcial do objeto; (3) fundos complexos com pouco contraste. Por outro lado, a precisão de 0.460 no teste mostra que o modelo ainda gera alguns falsos positivos. Ambos os tipos de erro são esperados com apenas 100 imagens de treino e seriam mitigados com dataset maior e mais diverso.</w:t>
       </w:r>
     </w:p>
     <w:p>

</xml_diff>

<commit_message>
Corrige analise qualitativa das predicoes no relatorio
Reinterpretacao das 3 imagens de exemplo apos analise visual cuidadosa:

(a) Falso positivo por duplicacao de bounding box
    Apenas 1 fuzil real, mas o modelo gerou 2 caixas.
    Indica falha do NMS em eliminar deteccoes redundantes.

(b) Erro de localizacao (vies de fundo)
    Fuzil detectado corretamente; pistola detectada como classe mas
    em regiao errada da imagem (nao na mao da mulher onde aparece).
    Sugere que o modelo associou a pistola a pistas de fundo.

(c) Falso negativo (mantido)
    Arma presente, nao detectada - limite de generalizacao.

Sintese atualizada relaciona os 3 tipos de erro a causa raiz comum:
volume insuficiente de dados para generalizacao robusta.

Co-Authored-By: Claude Opus 4.7 <noreply@anthropic.com>
</commit_message>
<xml_diff>
--- a/relatorio_trabalho_pratico.docx
+++ b/relatorio_trabalho_pratico.docx
@@ -1855,7 +1855,7 @@
           <w:i w:val="0"/>
           <w:sz w:val="22"/>
         </w:rPr>
-        <w:t>Análise qualitativa: predições corretas e incorretas</w:t>
+        <w:t>Análise qualitativa: tipos de erro observados</w:t>
       </w:r>
     </w:p>
     <w:p>
@@ -1865,7 +1865,7 @@
           <w:i w:val="0"/>
           <w:sz w:val="22"/>
         </w:rPr>
-        <w:t>Na execução de inferência sobre as 15 imagens do conjunto de teste, o modelo detectou armas em 13 imagens e falhou em 2 (falsos negativos). Abaixo são apresentados exemplos representativos de cada caso.</w:t>
+        <w:t>A inspeção visual das 15 imagens do conjunto de teste revelou três padrões distintos de erro que ajudam a entender as limitações do modelo. Esta análise complementa as métricas agregadas (precisão 0.460, recall 0.583 no teste) mostrando exemplos concretos.</w:t>
       </w:r>
     </w:p>
     <w:p/>
@@ -1876,7 +1876,7 @@
           <w:i w:val="0"/>
           <w:sz w:val="22"/>
         </w:rPr>
-        <w:t>(a) Predição correta — 2 fuzis:</w:t>
+        <w:t>(a) Falso positivo — bounding box duplicado sobre o mesmo objeto:</w:t>
       </w:r>
     </w:p>
     <w:p>
@@ -1892,7 +1892,7 @@
               <a:graphicData uri="http://schemas.openxmlformats.org/drawingml/2006/picture">
                 <pic:pic>
                   <pic:nvPicPr>
-                    <pic:cNvPr id="0" name="predicao_correta_fuzis.jpg"/>
+                    <pic:cNvPr id="0" name="erro_a_falso_positivo.jpg"/>
                     <pic:cNvPicPr/>
                   </pic:nvPicPr>
                   <pic:blipFill>
@@ -1924,7 +1924,7 @@
           <w:i/>
           <w:sz w:val="18"/>
         </w:rPr>
-        <w:t>Figura 5 — Detecção correta: 2 fuzis identificados com bounding boxes bem posicionados e alta confiança. O modelo separou corretamente os dois objetos sobrepostos.</w:t>
+        <w:t>Figura 5 — A imagem contém apenas 1 fuzil real, mas o modelo gerou 2 bounding boxes para o mesmo objeto. Isto caracteriza um falso positivo por detecção duplicada, situação em que o NMS (Non-Maximum Suppression) não foi suficiente para eliminar a caixa redundante. Ajustar o limiar de IoU do NMS ou aumentar o conjunto de treino com variações do mesmo objeto reduziria este erro.</w:t>
       </w:r>
     </w:p>
     <w:p/>
@@ -1935,7 +1935,7 @@
           <w:i w:val="0"/>
           <w:sz w:val="22"/>
         </w:rPr>
-        <w:t>(b) Predição correta — detecção mista (Pistola + Fuzil):</w:t>
+        <w:t>(b) Erro de localização — classe correta, posição incorreta:</w:t>
       </w:r>
     </w:p>
     <w:p>
@@ -1951,7 +1951,7 @@
               <a:graphicData uri="http://schemas.openxmlformats.org/drawingml/2006/picture">
                 <pic:pic>
                   <pic:nvPicPr>
-                    <pic:cNvPr id="0" name="predicao_correta_mista.jpg"/>
+                    <pic:cNvPr id="0" name="erro_b_localizacao.jpg"/>
                     <pic:cNvPicPr/>
                   </pic:nvPicPr>
                   <pic:blipFill>
@@ -1983,7 +1983,7 @@
           <w:i/>
           <w:sz w:val="18"/>
         </w:rPr>
-        <w:t>Figura 6 — Detecção correta de classes diferentes na mesma imagem: o modelo distinguiu corretamente a pistola do fuzil, mostrando que aprendeu as características discriminantes entre as duas classes.</w:t>
+        <w:t>Figura 6 — O fuzil foi detectado corretamente (classe e posição). Já a pistola, embora reconhecida como classe, foi localizada em uma região incorreta da imagem, e não na mão da mulher onde de fato aparece. Este tipo de erro sugere que o modelo aprendeu a associar a pistola a pistas contextuais erradas (possivelmente cores ou formas de fundo), indicando viés de fundo no treino. Mais diversidade de cenários no dataset mitigaria este problema.</w:t>
       </w:r>
     </w:p>
     <w:p/>
@@ -1994,7 +1994,7 @@
           <w:i w:val="0"/>
           <w:sz w:val="22"/>
         </w:rPr>
-        <w:t>(c) Predição incorreta (falso negativo):</w:t>
+        <w:t>(c) Falso negativo — arma presente, não detectada:</w:t>
       </w:r>
     </w:p>
     <w:p>
@@ -2010,7 +2010,7 @@
               <a:graphicData uri="http://schemas.openxmlformats.org/drawingml/2006/picture">
                 <pic:pic>
                   <pic:nvPicPr>
-                    <pic:cNvPr id="0" name="predicao_falso_negativo.jpg"/>
+                    <pic:cNvPr id="0" name="erro_c_falso_negativo.jpg"/>
                     <pic:cNvPicPr/>
                   </pic:nvPicPr>
                   <pic:blipFill>
@@ -2052,7 +2052,7 @@
           <w:i w:val="0"/>
           <w:sz w:val="22"/>
         </w:rPr>
-        <w:t>Discussão dos erros:</w:t>
+        <w:t>Síntese dos erros observados:</w:t>
       </w:r>
     </w:p>
     <w:p>
@@ -2062,7 +2062,7 @@
           <w:i w:val="0"/>
           <w:sz w:val="22"/>
         </w:rPr>
-        <w:t>O recall de 0.583 no conjunto de teste indica que aproximadamente 42% dos objetos anotados não foram detectados. Análise visual sugere que os falsos negativos ocorrem principalmente em imagens com: (1) ângulos atípicos não representados no treino; (2) oclusão parcial do objeto; (3) fundos complexos com pouco contraste. Por outro lado, a precisão de 0.460 no teste mostra que o modelo ainda gera alguns falsos positivos. Ambos os tipos de erro são esperados com apenas 100 imagens de treino e seriam mitigados com dataset maior e mais diverso.</w:t>
+        <w:t>Os três tipos de erro ilustrados — falso positivo por duplicação (a), erro de localização por viés de fundo (b) e falso negativo por falta de generalização (c) — apontam para a mesma causa raiz: o volume de treino é insuficiente para que o modelo aprenda representações robustas e invariantes ao contexto. Todos os problemas seriam atenuados com um dataset maior (1.000+ imagens por classe), maior diversidade de fundos e ângulos, e possivelmente ajustes finos nos limiares de NMS e confiança durante a inferência.</w:t>
       </w:r>
     </w:p>
     <w:p>

</xml_diff>

<commit_message>
Corrige legenda da figura 6: erros combinados na imagem (b)
A imagem (b) contem DOIS erros simultaneos:
- Falso negativo: pistola real na mao da mulher nao foi detectada
- Falso positivo: pistola detectada em regiao errada (sem arma)
- Fuzil detectado corretamente

Legenda reescrita para refletir a analise correta.

Co-Authored-By: Claude Opus 4.7 <noreply@anthropic.com>
</commit_message>
<xml_diff>
--- a/relatorio_trabalho_pratico.docx
+++ b/relatorio_trabalho_pratico.docx
@@ -1935,7 +1935,7 @@
           <w:i w:val="0"/>
           <w:sz w:val="22"/>
         </w:rPr>
-        <w:t>(b) Erro de localização — classe correta, posição incorreta:</w:t>
+        <w:t>(b) Erro combinado — falso positivo de localização + falso negativo:</w:t>
       </w:r>
     </w:p>
     <w:p>
@@ -1983,7 +1983,7 @@
           <w:i/>
           <w:sz w:val="18"/>
         </w:rPr>
-        <w:t>Figura 6 — O fuzil foi detectado corretamente (classe e posição). Já a pistola, embora reconhecida como classe, foi localizada em uma região incorreta da imagem, e não na mão da mulher onde de fato aparece. Este tipo de erro sugere que o modelo aprendeu a associar a pistola a pistas contextuais erradas (possivelmente cores ou formas de fundo), indicando viés de fundo no treino. Mais diversidade de cenários no dataset mitigaria este problema.</w:t>
+        <w:t>Figura 6 — A imagem apresenta dois erros simultâneos: (i) o fuzil foi detectado corretamente, mas (ii) a pistola real, que a mulher está segurando na mão, não foi detectada (falso negativo); e (iii) o modelo ainda gerou um bounding box de pistola em uma região incorreta da imagem onde não há arma alguma (falso positivo). Isso sugere que o modelo aprendeu a associar a pistola a pistas contextuais erradas (possivelmente cores ou formas de fundo) em vez de se apoiar nas características visuais da arma em si, indicando viés de fundo no treino. Mais diversidade de cenários e poses no dataset mitigariam este problema.</w:t>
       </w:r>
     </w:p>
     <w:p/>

</xml_diff>

<commit_message>
Reescreve secao 1 (Descricao do Problema) com enfoque mais detalhado
- Define o problema como deteccao de objetos (localizacao + classificacao)
- Distingue explicitamente Pistola (arma curta) de Fuzil (arma longa)
- Detalha 3 cenarios de aplicacao: videomonitoramento urbano, analise
  forense e operacoes de seguranca em campo
- Mantem justificativa do uso de visao computacional e Transfer Learning
- Registra que o projeto e uma prova de conceito em escala experimental

Co-Authored-By: Claude Opus 4.7 <noreply@anthropic.com>
</commit_message>
<xml_diff>
--- a/relatorio_trabalho_pratico.docx
+++ b/relatorio_trabalho_pratico.docx
@@ -42,7 +42,7 @@
           <w:i w:val="0"/>
           <w:sz w:val="22"/>
         </w:rPr>
-        <w:t>A detecção automática de armas de fogo em imagens é um problema de segurança pública de alta relevância. Em ambientes como câmeras de vigilância, sistemas de controle de acesso e cenas de crimes, identificar a presença de pistolas ou fuzis de forma rápida e precisa pode acelerar a resposta de agentes de segurança e auxiliar investigações forenses.</w:t>
+        <w:t>Este trabalho trata da identificação automática de armas de fogo em imagens, com a tarefa de distinguir entre duas categorias específicas: Pistola (arma curta) e Fuzil (arma longa). Dada uma imagem de entrada, espera-se que o sistema realize duas operações de forma integrada — delimitar a região onde a arma aparece por meio de uma caixa delimitadora (bounding box) e atribuir a essa região a classe correta. Por combinar localização espacial e classificação em um único fluxo, o problema se enquadra na categoria de detecção de objetos.</w:t>
       </w:r>
     </w:p>
     <w:p>
@@ -52,7 +52,60 @@
           <w:i w:val="0"/>
           <w:sz w:val="22"/>
         </w:rPr>
-        <w:t>A visão computacional é a abordagem mais adequada para este problema pois: (1) opera em tempo real sobre fluxos de vídeo; (2) não requer contato físico ou presença humana constante; e (3) modelos de detecção de objetos modernos, como o YOLOv8, atingem alta precisão mesmo com datasets relativamente pequenos via Transfer Learning.</w:t>
+        <w:t>A capacidade de detectar armas automaticamente tem aplicação direta em segurança pública e monitoramento. Entre os cenários de uso mais promissores podem ser citados:</w:t>
+      </w:r>
+    </w:p>
+    <w:p>
+      <w:pPr>
+        <w:pStyle w:val="ListBullet"/>
+      </w:pPr>
+      <w:r>
+        <w:rPr>
+          <w:sz w:val="22"/>
+        </w:rPr>
+        <w:t>Videomonitoramento urbano — câmeras instaladas em ruas, estações de transporte, escolas e estabelecimentos comerciais poderiam ser acopladas a um sistema de detecção capaz de gerar alertas em tempo real para forças de segurança ao identificar a presença de uma arma;</w:t>
+      </w:r>
+    </w:p>
+    <w:p>
+      <w:pPr>
+        <w:pStyle w:val="ListBullet"/>
+      </w:pPr>
+      <w:r>
+        <w:rPr>
+          <w:sz w:val="22"/>
+        </w:rPr>
+        <w:t>Análise forense de imagens e vídeos — em investigações criminais, o modelo pode apoiar a triagem de grandes volumes de material audiovisual, destacando automaticamente trechos que contenham armas e reduzindo o esforço manual de peritos;</w:t>
+      </w:r>
+    </w:p>
+    <w:p>
+      <w:pPr>
+        <w:pStyle w:val="ListBullet"/>
+      </w:pPr>
+      <w:r>
+        <w:rPr>
+          <w:sz w:val="22"/>
+        </w:rPr>
+        <w:t>Operações de segurança em campo — drones, câmeras corporais ou plataformas móveis poderiam embarcar o modelo para fornecer, a agentes policiais ou militares, informação visual classificada durante a operação.</w:t>
+      </w:r>
+    </w:p>
+    <w:p>
+      <w:r>
+        <w:rPr>
+          <w:b w:val="0"/>
+          <w:i w:val="0"/>
+          <w:sz w:val="22"/>
+        </w:rPr>
+        <w:t>A visão computacional é a abordagem mais adequada para este cenário por três razões: (1) opera diretamente sobre o sinal visual, sem necessidade de sensores adicionais ou presença humana contínua; (2) arquiteturas modernas de detecção como o YOLOv8 atingem velocidade suficiente para uso em tempo real; e (3) a estratégia de Transfer Learning permite obter resultados razoáveis mesmo com datasets relativamente pequenos, aproveitando representações visuais já aprendidas em bases maiores.</w:t>
+      </w:r>
+    </w:p>
+    <w:p>
+      <w:r>
+        <w:rPr>
+          <w:b w:val="0"/>
+          <w:i w:val="0"/>
+          <w:sz w:val="22"/>
+        </w:rPr>
+        <w:t>No presente trabalho, o modelo foi desenvolvido em escala experimental, com foco na prova de conceito da capacidade de discriminação entre armas curtas (pistolas) e armas longas (fuzis), servindo como ponto de partida para sistemas mais robustos em ambientes reais.</w:t>
       </w:r>
     </w:p>
     <w:p>

</xml_diff>

<commit_message>
Adiciona estrutura de pastas do dataset na secao 3
Inclui arvore de diretorios com quantidade de arquivos em cada pasta:
- train/images (211: 101 positivas + 110 negativas)
- train/labels (101)
- val/images e labels (15 cada)
- test/images e labels (15 cada)
- negativos/ (110 backup)

Adiciona observacoes sobre o formato YOLO das labels e o uso das
imagens negativas como exemplos de fundo no treino.

Co-Authored-By: Claude Opus 4.7 <noreply@anthropic.com>
</commit_message>
<xml_diff>
--- a/relatorio_trabalho_pratico.docx
+++ b/relatorio_trabalho_pratico.docx
@@ -202,6 +202,57 @@
           <w:sz w:val="22"/>
         </w:rPr>
         <w:t>O dataset foi montado manualmente com imagens coletadas de fontes públicas (internet) e rotulado com a ferramenta YoloLabel. As imagens representam pistolas e fuzis em diferentes contextos: fundos neutros, cenas de ação, renders 3D e fotografias reais.</w:t>
+      </w:r>
+    </w:p>
+    <w:p>
+      <w:r>
+        <w:rPr>
+          <w:b/>
+          <w:i w:val="0"/>
+          <w:sz w:val="22"/>
+        </w:rPr>
+        <w:t>Estrutura de pastas do dataset:</w:t>
+      </w:r>
+    </w:p>
+    <w:p>
+      <w:r>
+        <w:rPr>
+          <w:rFonts w:ascii="Courier New" w:hAnsi="Courier New"/>
+          <w:sz w:val="18"/>
+        </w:rPr>
+        <w:t>dataset/</w:t>
+        <w:br/>
+        <w:t>├── train/</w:t>
+        <w:br/>
+        <w:t>│   ├── images/      → 211 imagens (101 positivas + 110 negativas)</w:t>
+        <w:br/>
+        <w:t>│   └── labels/      → 101 arquivos .txt no formato YOLO</w:t>
+        <w:br/>
+        <w:t>├── val/</w:t>
+        <w:br/>
+        <w:t>│   ├── images/      →  15 imagens</w:t>
+        <w:br/>
+        <w:t>│   └── labels/      →  15 arquivos .txt</w:t>
+        <w:br/>
+        <w:t>├── test/</w:t>
+        <w:br/>
+        <w:t>│   ├── images/      →  15 imagens</w:t>
+        <w:br/>
+        <w:t>│   └── labels/      →  15 arquivos .txt</w:t>
+        <w:br/>
+        <w:t>└── negativos/       → 110 imagens sem armas (backup das negativas</w:t>
+        <w:br/>
+        <w:t xml:space="preserve">                        usadas no treino para reduzir falsos positivos)</w:t>
+      </w:r>
+    </w:p>
+    <w:p>
+      <w:r>
+        <w:rPr>
+          <w:b w:val="0"/>
+          <w:i w:val="0"/>
+          <w:sz w:val="22"/>
+        </w:rPr>
+        <w:t>Observações sobre a organização: (1) as imagens negativas foram adicionadas à pasta train/images sem arquivo de label correspondente — o YOLO interpreta imagens sem label como exemplos de fundo, úteis para reduzir falsos positivos; (2) os arquivos .txt seguem o formato YOLO (uma linha por objeto: classe x_centro y_centro largura altura, com coordenadas normalizadas de 0 a 1); (3) o dataset completo totaliza 241 imagens (131 com armas + 110 sem armas).</w:t>
       </w:r>
     </w:p>
     <w:p>

</xml_diff>

<commit_message>
Corrige legenda da figura 8 (deteccao sobreposta)
A imagem tem 1 fuzil + 1 pistola (ambos reais), corretamente detectados.
O erro e um falso positivo de classe: pistola adicional detectada
sobrepondo a regiao do fuzil (provavelmente confundiu coronha ou cabo
do fuzil com uma pistola).

Legenda reescrita para descrever corretamente o tipo de erro.

Co-Authored-By: Claude Opus 4.7 <noreply@anthropic.com>
</commit_message>
<xml_diff>
--- a/relatorio_trabalho_pratico.docx
+++ b/relatorio_trabalho_pratico.docx
@@ -2157,7 +2157,7 @@
           <w:i w:val="0"/>
           <w:sz w:val="22"/>
         </w:rPr>
-        <w:t>(d) Cena complexa — múltiplas detecções:</w:t>
+        <w:t>(d) Falso positivo por sobreposição de classes:</w:t>
       </w:r>
     </w:p>
     <w:p>
@@ -2205,7 +2205,7 @@
           <w:i/>
           <w:sz w:val="18"/>
         </w:rPr>
-        <w:t>Figura 8 — Cena com múltiplas armas, onde o modelo detectou 1 fuzil e 2 pistolas. Em imagens com vários objetos ou oclusão, o modelo pode gerar falsos positivos adicionais, sugerindo que ainda há viés de contexto aprendido durante o treino.</w:t>
+        <w:t>Figura 8 — A imagem contém 1 fuzil e 1 pistola (ambos reais). O modelo detectou corretamente as duas armas, mas gerou uma detecção adicional de pistola sobrepondo a região do fuzil — um falso positivo de classe. Este tipo de erro sugere que o modelo ainda não aprendeu completamente a distinguir características visuais entre as duas classes em regiões próximas, possivelmente confundindo partes do fuzil (como a coronha ou o cabo) com uma pistola. Ajustes no limiar de confiança durante a inferência ou treino com mais exemplos de armas sobrepostas mitigariam este erro.</w:t>
       </w:r>
     </w:p>
     <w:p>

</xml_diff>

<commit_message>
Adiciona link do repositorio GitHub abaixo do titulo do relatorio
O link https://github.com/suellynschopping/trabalho_pratico_suellyn
agora aparece centralizado abaixo do subtitulo, formatado com cor
azul e sublinhado (estilo hyperlink).

Co-Authored-By: Claude Opus 4.7 <noreply@anthropic.com>
</commit_message>
<xml_diff>
--- a/relatorio_trabalho_pratico.docx
+++ b/relatorio_trabalho_pratico.docx
@@ -21,6 +21,25 @@
           <w:sz w:val="26"/>
         </w:rPr>
         <w:t>Detecção de Armas com YOLOv8 — Transfer Learning</w:t>
+      </w:r>
+    </w:p>
+    <w:p>
+      <w:pPr>
+        <w:jc w:val="center"/>
+      </w:pPr>
+      <w:r>
+        <w:rPr>
+          <w:sz w:val="22"/>
+        </w:rPr>
+        <w:t xml:space="preserve">Repositório: </w:t>
+      </w:r>
+      <w:r>
+        <w:rPr>
+          <w:color w:val="0056B3"/>
+          <w:sz w:val="22"/>
+          <w:u w:val="single"/>
+        </w:rPr>
+        <w:t>https://github.com/suellynschopping/trabalho_pratico_suellyn</w:t>
       </w:r>
     </w:p>
     <w:p/>

</xml_diff>